<commit_message>
- Added the diagram that took me 4 hours to make because we dont like AI design.
</commit_message>
<xml_diff>
--- a/Ex03 Gal 209385509 Lihi 314958042/Ex03_ClassDiagrams.docx
+++ b/Ex03 Gal 209385509 Lihi 314958042/Ex03_ClassDiagrams.docx
@@ -1,6 +1,6 @@
 
 <file path=word/document.xml><?xml version="1.0" encoding="utf-8"?>
-<w:document xmlns:wpc="http://schemas.microsoft.com/office/word/2010/wordprocessingCanvas" xmlns:cx="http://schemas.microsoft.com/office/drawing/2014/chartex" xmlns:cx1="http://schemas.microsoft.com/office/drawing/2015/9/8/chartex" xmlns:cx2="http://schemas.microsoft.com/office/drawing/2015/10/21/chartex" xmlns:cx3="http://schemas.microsoft.com/office/drawing/2016/5/9/chartex" xmlns:cx4="http://schemas.microsoft.com/office/drawing/2016/5/10/chartex" xmlns:cx5="http://schemas.microsoft.com/office/drawing/2016/5/11/chartex" xmlns:cx6="http://schemas.microsoft.com/office/drawing/2016/5/12/chartex" xmlns:cx7="http://schemas.microsoft.com/office/drawing/2016/5/13/chartex" xmlns:cx8="http://schemas.microsoft.com/office/drawing/2016/5/14/chartex" xmlns:mc="http://schemas.openxmlformats.org/markup-compatibility/2006" xmlns:aink="http://schemas.microsoft.com/office/drawing/2016/ink" xmlns:am3d="http://schemas.microsoft.com/office/drawing/2017/model3d" xmlns:o="urn:schemas-microsoft-com:office:office" xmlns:oel="http://schemas.microsoft.com/office/2019/extlst" xmlns:r="http://schemas.openxmlformats.org/officeDocument/2006/relationships" xmlns:m="http://schemas.openxmlformats.org/officeDocument/2006/math" xmlns:v="urn:schemas-microsoft-com:vml" xmlns:wp14="http://schemas.microsoft.com/office/word/2010/wordprocessingDrawing" xmlns:wp="http://schemas.openxmlformats.org/drawingml/2006/wordprocessingDrawing" xmlns:w10="urn:schemas-microsoft-com:office:word" xmlns:w="http://schemas.openxmlformats.org/wordprocessingml/2006/main" xmlns:w14="http://schemas.microsoft.com/office/word/2010/wordml" xmlns:w15="http://schemas.microsoft.com/office/word/2012/wordml" xmlns:w16cex="http://schemas.microsoft.com/office/word/2018/wordml/cex" xmlns:w16cid="http://schemas.microsoft.com/office/word/2016/wordml/cid" xmlns:w16="http://schemas.microsoft.com/office/word/2018/wordml" xmlns:w16du="http://schemas.microsoft.com/office/word/2023/wordml/word16du" xmlns:w16sdtdh="http://schemas.microsoft.com/office/word/2020/wordml/sdtdatahash" xmlns:w16sdtfl="http://schemas.microsoft.com/office/word/2024/wordml/sdtformatlock" xmlns:w16se="http://schemas.microsoft.com/office/word/2015/wordml/symex" xmlns:wpg="http://schemas.microsoft.com/office/word/2010/wordprocessingGroup" xmlns:wpi="http://schemas.microsoft.com/office/word/2010/wordprocessingInk" xmlns:wne="http://schemas.microsoft.com/office/word/2006/wordml" xmlns:wps="http://schemas.microsoft.com/office/word/2010/wordprocessingShape" mc:Ignorable="w14 w15 w16se w16cid w16 w16cex w16sdtdh w16sdtfl w16du wp14">
+<w:document xmlns:wpc="http://schemas.microsoft.com/office/word/2010/wordprocessingCanvas" xmlns:cx="http://schemas.microsoft.com/office/drawing/2014/chartex" xmlns:cx1="http://schemas.microsoft.com/office/drawing/2015/9/8/chartex" xmlns:cx2="http://schemas.microsoft.com/office/drawing/2015/10/21/chartex" xmlns:cx3="http://schemas.microsoft.com/office/drawing/2016/5/9/chartex" xmlns:cx4="http://schemas.microsoft.com/office/drawing/2016/5/10/chartex" xmlns:cx5="http://schemas.microsoft.com/office/drawing/2016/5/11/chartex" xmlns:cx6="http://schemas.microsoft.com/office/drawing/2016/5/12/chartex" xmlns:cx7="http://schemas.microsoft.com/office/drawing/2016/5/13/chartex" xmlns:cx8="http://schemas.microsoft.com/office/drawing/2016/5/14/chartex" xmlns:mc="http://schemas.openxmlformats.org/markup-compatibility/2006" xmlns:aink="http://schemas.microsoft.com/office/drawing/2016/ink" xmlns:am3d="http://schemas.microsoft.com/office/drawing/2017/model3d" xmlns:o="urn:schemas-microsoft-com:office:office" xmlns:r="http://schemas.openxmlformats.org/officeDocument/2006/relationships" xmlns:m="http://schemas.openxmlformats.org/officeDocument/2006/math" xmlns:v="urn:schemas-microsoft-com:vml" xmlns:wp14="http://schemas.microsoft.com/office/word/2010/wordprocessingDrawing" xmlns:wp="http://schemas.openxmlformats.org/drawingml/2006/wordprocessingDrawing" xmlns:w10="urn:schemas-microsoft-com:office:word" xmlns:w="http://schemas.openxmlformats.org/wordprocessingml/2006/main" xmlns:w14="http://schemas.microsoft.com/office/word/2010/wordml" xmlns:w15="http://schemas.microsoft.com/office/word/2012/wordml" xmlns:w16cid="http://schemas.microsoft.com/office/word/2016/wordml/cid" xmlns:w16se="http://schemas.microsoft.com/office/word/2015/wordml/symex" xmlns:wpg="http://schemas.microsoft.com/office/word/2010/wordprocessingGroup" xmlns:wpi="http://schemas.microsoft.com/office/word/2010/wordprocessingInk" xmlns:wne="http://schemas.microsoft.com/office/word/2006/wordml" xmlns:wps="http://schemas.microsoft.com/office/word/2010/wordprocessingShape" mc:Ignorable="w14 w15 w16se w16cid wp14">
   <w:body>
     <w:p>
       <w:pPr>
@@ -116,7 +116,7 @@
                 <v:stroke joinstyle="miter"/>
                 <v:path gradientshapeok="t" o:connecttype="rect"/>
               </v:shapetype>
-              <v:shape id="Text Box 4" o:spid="_x0000_s1026" type="#_x0000_t202" style="position:absolute;left:0;text-align:left;margin-left:0;margin-top:-18pt;width:414pt;height:27pt;z-index:251657728;visibility:visible;mso-wrap-style:square;mso-width-percent:0;mso-height-percent:0;mso-wrap-distance-left:9pt;mso-wrap-distance-top:0;mso-wrap-distance-right:9pt;mso-wrap-distance-bottom:0;mso-position-horizontal:absolute;mso-position-horizontal-relative:text;mso-position-vertical:absolute;mso-position-vertical-relative:text;mso-width-percent:0;mso-height-percent:0;mso-width-relative:page;mso-height-relative:page;v-text-anchor:top" o:gfxdata="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" fillcolor="gray">
+              <v:shape id="Text Box 4" o:spid="_x0000_s1026" type="#_x0000_t202" style="position:absolute;left:0;text-align:left;margin-left:0;margin-top:-18pt;width:414pt;height:27pt;z-index:251657728;visibility:visible;mso-wrap-style:square;mso-width-percent:0;mso-height-percent:0;mso-wrap-distance-left:9pt;mso-wrap-distance-top:0;mso-wrap-distance-right:9pt;mso-wrap-distance-bottom:0;mso-position-horizontal:absolute;mso-position-horizontal-relative:text;mso-position-vertical:absolute;mso-position-vertical-relative:text;mso-width-percent:0;mso-height-percent:0;mso-width-relative:page;mso-height-relative:page;v-text-anchor:top" o:gfxdata="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" fillcolor="gray">
                 <v:textbox>
                   <w:txbxContent>
                     <w:p>
@@ -183,7 +183,7 @@
       </w:pPr>
       <w:r>
         <w:rPr>
-          <w:rStyle w:val="PageNumber"/>
+          <w:rStyle w:val="a4"/>
           <w:rFonts w:ascii="Arial" w:hAnsi="Arial" w:cs="Arial" w:hint="cs"/>
           <w:b/>
           <w:bCs/>
@@ -197,7 +197,7 @@
       </w:r>
       <w:r>
         <w:rPr>
-          <w:rStyle w:val="PageNumber"/>
+          <w:rStyle w:val="a4"/>
           <w:rFonts w:ascii="Arial" w:hAnsi="Arial" w:cs="Arial" w:hint="cs"/>
           <w:b/>
           <w:bCs/>
@@ -211,7 +211,7 @@
       </w:r>
       <w:r>
         <w:rPr>
-          <w:rStyle w:val="PageNumber"/>
+          <w:rStyle w:val="a4"/>
           <w:rFonts w:ascii="Arial" w:hAnsi="Arial" w:cs="Arial"/>
           <w:b/>
           <w:bCs/>
@@ -816,7 +816,7 @@
             <w:pPr>
               <w:jc w:val="center"/>
               <w:rPr>
-                <w:rFonts w:ascii="Arial" w:hAnsi="Arial" w:cs="Arial" w:hint="cs"/>
+                <w:rFonts w:ascii="Arial" w:hAnsi="Arial" w:cs="Arial"/>
               </w:rPr>
             </w:pPr>
             <w:r>
@@ -877,7 +877,7 @@
             <w:pPr>
               <w:jc w:val="center"/>
               <w:rPr>
-                <w:rFonts w:ascii="Arial" w:hAnsi="Arial" w:cs="Arial" w:hint="cs"/>
+                <w:rFonts w:ascii="Arial" w:hAnsi="Arial" w:cs="Arial"/>
                 <w:rtl/>
               </w:rPr>
             </w:pPr>
@@ -1211,7 +1211,7 @@
             <w:pPr>
               <w:jc w:val="center"/>
               <w:rPr>
-                <w:rFonts w:ascii="Arial" w:hAnsi="Arial" w:cs="Arial" w:hint="cs"/>
+                <w:rFonts w:ascii="Arial" w:hAnsi="Arial" w:cs="Arial"/>
                 <w:rtl/>
               </w:rPr>
             </w:pPr>
@@ -1790,7 +1790,7 @@
             <w:pPr>
               <w:jc w:val="center"/>
               <w:rPr>
-                <w:rFonts w:ascii="Arial" w:hAnsi="Arial" w:cs="Arial" w:hint="cs"/>
+                <w:rFonts w:ascii="Arial" w:hAnsi="Arial" w:cs="Arial"/>
                 <w:rtl/>
               </w:rPr>
             </w:pPr>
@@ -1844,21 +1844,6 @@
           <w:rFonts w:ascii="Arial" w:hAnsi="Arial" w:cs="Arial"/>
           <w:sz w:val="18"/>
           <w:szCs w:val="18"/>
-          <w:rtl/>
-        </w:rPr>
-      </w:pPr>
-    </w:p>
-    <w:p>
-      <w:pPr>
-        <w:pBdr>
-          <w:bottom w:val="single" w:sz="12" w:space="1" w:color="auto"/>
-        </w:pBdr>
-        <w:rPr>
-          <w:rFonts w:ascii="Arial" w:hAnsi="Arial" w:cs="Arial"/>
-          <w:b/>
-          <w:bCs/>
-          <w:sz w:val="26"/>
-          <w:szCs w:val="26"/>
           <w:rtl/>
         </w:rPr>
       </w:pPr>
@@ -1878,8 +1863,6 @@
       <w:r>
         <w:rPr>
           <w:rFonts w:ascii="Arial" w:hAnsi="Arial" w:cs="Arial"/>
-          <w:b/>
-          <w:bCs/>
           <w:sz w:val="26"/>
           <w:szCs w:val="26"/>
           <w:rtl/>
@@ -1910,10 +1893,77 @@
           <w:rtl/>
         </w:rPr>
       </w:pPr>
+      <w:bookmarkStart w:id="0" w:name="_GoBack"/>
+      <w:bookmarkEnd w:id="0"/>
+      <w:r>
+        <w:rPr>
+          <w:rFonts w:ascii="Arial" w:hAnsi="Arial" w:cs="Arial"/>
+          <w:b/>
+          <w:bCs/>
+          <w:sz w:val="18"/>
+          <w:szCs w:val="18"/>
+          <w:rtl/>
+        </w:rPr>
+        <w:drawing>
+          <wp:anchor distT="0" distB="0" distL="114300" distR="114300" simplePos="0" relativeHeight="251658752" behindDoc="0" locked="0" layoutInCell="1" allowOverlap="1" wp14:anchorId="5B35F1EA" wp14:editId="70444DB4">
+            <wp:simplePos x="0" y="0"/>
+            <wp:positionH relativeFrom="column">
+              <wp:posOffset>-716280</wp:posOffset>
+            </wp:positionH>
+            <wp:positionV relativeFrom="paragraph">
+              <wp:posOffset>166370</wp:posOffset>
+            </wp:positionV>
+            <wp:extent cx="6865620" cy="8644633"/>
+            <wp:effectExtent l="0" t="0" r="0" b="4445"/>
+            <wp:wrapSquare wrapText="bothSides"/>
+            <wp:docPr id="3" name="תמונה 3"/>
+            <wp:cNvGraphicFramePr>
+              <a:graphicFrameLocks xmlns:a="http://schemas.openxmlformats.org/drawingml/2006/main" noChangeAspect="1"/>
+            </wp:cNvGraphicFramePr>
+            <a:graphic xmlns:a="http://schemas.openxmlformats.org/drawingml/2006/main">
+              <a:graphicData uri="http://schemas.openxmlformats.org/drawingml/2006/picture">
+                <pic:pic xmlns:pic="http://schemas.openxmlformats.org/drawingml/2006/picture">
+                  <pic:nvPicPr>
+                    <pic:cNvPr id="1" name=""/>
+                    <pic:cNvPicPr/>
+                  </pic:nvPicPr>
+                  <pic:blipFill>
+                    <a:blip r:embed="rId7">
+                      <a:extLst>
+                        <a:ext uri="{28A0092B-C50C-407E-A947-70E740481C1C}">
+                          <a14:useLocalDpi xmlns:a14="http://schemas.microsoft.com/office/drawing/2010/main" val="0"/>
+                        </a:ext>
+                      </a:extLst>
+                    </a:blip>
+                    <a:stretch>
+                      <a:fillRect/>
+                    </a:stretch>
+                  </pic:blipFill>
+                  <pic:spPr>
+                    <a:xfrm>
+                      <a:off x="0" y="0"/>
+                      <a:ext cx="6865620" cy="8644633"/>
+                    </a:xfrm>
+                    <a:prstGeom prst="rect">
+                      <a:avLst/>
+                    </a:prstGeom>
+                  </pic:spPr>
+                </pic:pic>
+              </a:graphicData>
+            </a:graphic>
+            <wp14:sizeRelH relativeFrom="margin">
+              <wp14:pctWidth>0</wp14:pctWidth>
+            </wp14:sizeRelH>
+            <wp14:sizeRelV relativeFrom="margin">
+              <wp14:pctHeight>0</wp14:pctHeight>
+            </wp14:sizeRelV>
+          </wp:anchor>
+        </w:drawing>
+      </w:r>
     </w:p>
     <w:sectPr>
-      <w:headerReference w:type="even" r:id="rId7"/>
-      <w:footerReference w:type="even" r:id="rId8"/>
+      <w:headerReference w:type="even" r:id="rId8"/>
+      <w:footerReference w:type="even" r:id="rId9"/>
       <w:pgSz w:w="11906" w:h="16838"/>
       <w:pgMar w:top="709" w:right="1800" w:bottom="1440" w:left="1800" w:header="708" w:footer="708" w:gutter="0"/>
       <w:cols w:space="708"/>
@@ -1926,7 +1976,7 @@
 </file>
 
 <file path=word/endnotes.xml><?xml version="1.0" encoding="utf-8"?>
-<w:endnotes xmlns:wpc="http://schemas.microsoft.com/office/word/2010/wordprocessingCanvas" xmlns:cx="http://schemas.microsoft.com/office/drawing/2014/chartex" xmlns:cx1="http://schemas.microsoft.com/office/drawing/2015/9/8/chartex" xmlns:cx2="http://schemas.microsoft.com/office/drawing/2015/10/21/chartex" xmlns:cx3="http://schemas.microsoft.com/office/drawing/2016/5/9/chartex" xmlns:cx4="http://schemas.microsoft.com/office/drawing/2016/5/10/chartex" xmlns:cx5="http://schemas.microsoft.com/office/drawing/2016/5/11/chartex" xmlns:cx6="http://schemas.microsoft.com/office/drawing/2016/5/12/chartex" xmlns:cx7="http://schemas.microsoft.com/office/drawing/2016/5/13/chartex" xmlns:cx8="http://schemas.microsoft.com/office/drawing/2016/5/14/chartex" xmlns:mc="http://schemas.openxmlformats.org/markup-compatibility/2006" xmlns:aink="http://schemas.microsoft.com/office/drawing/2016/ink" xmlns:am3d="http://schemas.microsoft.com/office/drawing/2017/model3d" xmlns:o="urn:schemas-microsoft-com:office:office" xmlns:oel="http://schemas.microsoft.com/office/2019/extlst" xmlns:r="http://schemas.openxmlformats.org/officeDocument/2006/relationships" xmlns:m="http://schemas.openxmlformats.org/officeDocument/2006/math" xmlns:v="urn:schemas-microsoft-com:vml" xmlns:wp14="http://schemas.microsoft.com/office/word/2010/wordprocessingDrawing" xmlns:wp="http://schemas.openxmlformats.org/drawingml/2006/wordprocessingDrawing" xmlns:w10="urn:schemas-microsoft-com:office:word" xmlns:w="http://schemas.openxmlformats.org/wordprocessingml/2006/main" xmlns:w14="http://schemas.microsoft.com/office/word/2010/wordml" xmlns:w15="http://schemas.microsoft.com/office/word/2012/wordml" xmlns:w16cex="http://schemas.microsoft.com/office/word/2018/wordml/cex" xmlns:w16cid="http://schemas.microsoft.com/office/word/2016/wordml/cid" xmlns:w16="http://schemas.microsoft.com/office/word/2018/wordml" xmlns:w16du="http://schemas.microsoft.com/office/word/2023/wordml/word16du" xmlns:w16sdtdh="http://schemas.microsoft.com/office/word/2020/wordml/sdtdatahash" xmlns:w16sdtfl="http://schemas.microsoft.com/office/word/2024/wordml/sdtformatlock" xmlns:w16se="http://schemas.microsoft.com/office/word/2015/wordml/symex" xmlns:wpg="http://schemas.microsoft.com/office/word/2010/wordprocessingGroup" xmlns:wpi="http://schemas.microsoft.com/office/word/2010/wordprocessingInk" xmlns:wne="http://schemas.microsoft.com/office/word/2006/wordml" xmlns:wps="http://schemas.microsoft.com/office/word/2010/wordprocessingShape" mc:Ignorable="w14 w15 w16se w16cid w16 w16cex w16sdtdh w16sdtfl w16du wp14">
+<w:endnotes xmlns:wpc="http://schemas.microsoft.com/office/word/2010/wordprocessingCanvas" xmlns:cx="http://schemas.microsoft.com/office/drawing/2014/chartex" xmlns:cx1="http://schemas.microsoft.com/office/drawing/2015/9/8/chartex" xmlns:cx2="http://schemas.microsoft.com/office/drawing/2015/10/21/chartex" xmlns:cx3="http://schemas.microsoft.com/office/drawing/2016/5/9/chartex" xmlns:cx4="http://schemas.microsoft.com/office/drawing/2016/5/10/chartex" xmlns:cx5="http://schemas.microsoft.com/office/drawing/2016/5/11/chartex" xmlns:cx6="http://schemas.microsoft.com/office/drawing/2016/5/12/chartex" xmlns:cx7="http://schemas.microsoft.com/office/drawing/2016/5/13/chartex" xmlns:cx8="http://schemas.microsoft.com/office/drawing/2016/5/14/chartex" xmlns:mc="http://schemas.openxmlformats.org/markup-compatibility/2006" xmlns:aink="http://schemas.microsoft.com/office/drawing/2016/ink" xmlns:am3d="http://schemas.microsoft.com/office/drawing/2017/model3d" xmlns:o="urn:schemas-microsoft-com:office:office" xmlns:r="http://schemas.openxmlformats.org/officeDocument/2006/relationships" xmlns:m="http://schemas.openxmlformats.org/officeDocument/2006/math" xmlns:v="urn:schemas-microsoft-com:vml" xmlns:wp14="http://schemas.microsoft.com/office/word/2010/wordprocessingDrawing" xmlns:wp="http://schemas.openxmlformats.org/drawingml/2006/wordprocessingDrawing" xmlns:w10="urn:schemas-microsoft-com:office:word" xmlns:w="http://schemas.openxmlformats.org/wordprocessingml/2006/main" xmlns:w14="http://schemas.microsoft.com/office/word/2010/wordml" xmlns:w15="http://schemas.microsoft.com/office/word/2012/wordml" xmlns:w16cid="http://schemas.microsoft.com/office/word/2016/wordml/cid" xmlns:w16se="http://schemas.microsoft.com/office/word/2015/wordml/symex" xmlns:wpg="http://schemas.microsoft.com/office/word/2010/wordprocessingGroup" xmlns:wpi="http://schemas.microsoft.com/office/word/2010/wordprocessingInk" xmlns:wne="http://schemas.microsoft.com/office/word/2006/wordml" xmlns:wps="http://schemas.microsoft.com/office/word/2010/wordprocessingShape" mc:Ignorable="w14 w15 w16se w16cid wp14">
   <w:endnote w:type="separator" w:id="-1">
     <w:p>
       <w:r>
@@ -1945,31 +1995,31 @@
 </file>
 
 <file path=word/footer1.xml><?xml version="1.0" encoding="utf-8"?>
-<w:ftr xmlns:wpc="http://schemas.microsoft.com/office/word/2010/wordprocessingCanvas" xmlns:cx="http://schemas.microsoft.com/office/drawing/2014/chartex" xmlns:cx1="http://schemas.microsoft.com/office/drawing/2015/9/8/chartex" xmlns:cx2="http://schemas.microsoft.com/office/drawing/2015/10/21/chartex" xmlns:cx3="http://schemas.microsoft.com/office/drawing/2016/5/9/chartex" xmlns:cx4="http://schemas.microsoft.com/office/drawing/2016/5/10/chartex" xmlns:cx5="http://schemas.microsoft.com/office/drawing/2016/5/11/chartex" xmlns:cx6="http://schemas.microsoft.com/office/drawing/2016/5/12/chartex" xmlns:cx7="http://schemas.microsoft.com/office/drawing/2016/5/13/chartex" xmlns:cx8="http://schemas.microsoft.com/office/drawing/2016/5/14/chartex" xmlns:mc="http://schemas.openxmlformats.org/markup-compatibility/2006" xmlns:aink="http://schemas.microsoft.com/office/drawing/2016/ink" xmlns:am3d="http://schemas.microsoft.com/office/drawing/2017/model3d" xmlns:o="urn:schemas-microsoft-com:office:office" xmlns:oel="http://schemas.microsoft.com/office/2019/extlst" xmlns:r="http://schemas.openxmlformats.org/officeDocument/2006/relationships" xmlns:m="http://schemas.openxmlformats.org/officeDocument/2006/math" xmlns:v="urn:schemas-microsoft-com:vml" xmlns:wp14="http://schemas.microsoft.com/office/word/2010/wordprocessingDrawing" xmlns:wp="http://schemas.openxmlformats.org/drawingml/2006/wordprocessingDrawing" xmlns:w10="urn:schemas-microsoft-com:office:word" xmlns:w="http://schemas.openxmlformats.org/wordprocessingml/2006/main" xmlns:w14="http://schemas.microsoft.com/office/word/2010/wordml" xmlns:w15="http://schemas.microsoft.com/office/word/2012/wordml" xmlns:w16cex="http://schemas.microsoft.com/office/word/2018/wordml/cex" xmlns:w16cid="http://schemas.microsoft.com/office/word/2016/wordml/cid" xmlns:w16="http://schemas.microsoft.com/office/word/2018/wordml" xmlns:w16du="http://schemas.microsoft.com/office/word/2023/wordml/word16du" xmlns:w16sdtdh="http://schemas.microsoft.com/office/word/2020/wordml/sdtdatahash" xmlns:w16sdtfl="http://schemas.microsoft.com/office/word/2024/wordml/sdtformatlock" xmlns:w16se="http://schemas.microsoft.com/office/word/2015/wordml/symex" xmlns:wpg="http://schemas.microsoft.com/office/word/2010/wordprocessingGroup" xmlns:wpi="http://schemas.microsoft.com/office/word/2010/wordprocessingInk" xmlns:wne="http://schemas.microsoft.com/office/word/2006/wordml" xmlns:wps="http://schemas.microsoft.com/office/word/2010/wordprocessingShape" mc:Ignorable="w14 w15 w16se w16cid w16 w16cex w16sdtdh w16sdtfl w16du wp14">
+<w:ftr xmlns:wpc="http://schemas.microsoft.com/office/word/2010/wordprocessingCanvas" xmlns:cx="http://schemas.microsoft.com/office/drawing/2014/chartex" xmlns:cx1="http://schemas.microsoft.com/office/drawing/2015/9/8/chartex" xmlns:cx2="http://schemas.microsoft.com/office/drawing/2015/10/21/chartex" xmlns:cx3="http://schemas.microsoft.com/office/drawing/2016/5/9/chartex" xmlns:cx4="http://schemas.microsoft.com/office/drawing/2016/5/10/chartex" xmlns:cx5="http://schemas.microsoft.com/office/drawing/2016/5/11/chartex" xmlns:cx6="http://schemas.microsoft.com/office/drawing/2016/5/12/chartex" xmlns:cx7="http://schemas.microsoft.com/office/drawing/2016/5/13/chartex" xmlns:cx8="http://schemas.microsoft.com/office/drawing/2016/5/14/chartex" xmlns:mc="http://schemas.openxmlformats.org/markup-compatibility/2006" xmlns:aink="http://schemas.microsoft.com/office/drawing/2016/ink" xmlns:am3d="http://schemas.microsoft.com/office/drawing/2017/model3d" xmlns:o="urn:schemas-microsoft-com:office:office" xmlns:r="http://schemas.openxmlformats.org/officeDocument/2006/relationships" xmlns:m="http://schemas.openxmlformats.org/officeDocument/2006/math" xmlns:v="urn:schemas-microsoft-com:vml" xmlns:wp14="http://schemas.microsoft.com/office/word/2010/wordprocessingDrawing" xmlns:wp="http://schemas.openxmlformats.org/drawingml/2006/wordprocessingDrawing" xmlns:w10="urn:schemas-microsoft-com:office:word" xmlns:w="http://schemas.openxmlformats.org/wordprocessingml/2006/main" xmlns:w14="http://schemas.microsoft.com/office/word/2010/wordml" xmlns:w15="http://schemas.microsoft.com/office/word/2012/wordml" xmlns:w16cid="http://schemas.microsoft.com/office/word/2016/wordml/cid" xmlns:w16se="http://schemas.microsoft.com/office/word/2015/wordml/symex" xmlns:wpg="http://schemas.microsoft.com/office/word/2010/wordprocessingGroup" xmlns:wpi="http://schemas.microsoft.com/office/word/2010/wordprocessingInk" xmlns:wne="http://schemas.microsoft.com/office/word/2006/wordml" xmlns:wps="http://schemas.microsoft.com/office/word/2010/wordprocessingShape" mc:Ignorable="w14 w15 w16se w16cid wp14">
   <w:p>
     <w:pPr>
-      <w:pStyle w:val="Footer"/>
+      <w:pStyle w:val="a5"/>
       <w:framePr w:wrap="around" w:vAnchor="text" w:hAnchor="text" w:xAlign="center" w:y="1"/>
       <w:rPr>
-        <w:rStyle w:val="PageNumber"/>
+        <w:rStyle w:val="a4"/>
       </w:rPr>
     </w:pPr>
     <w:r>
       <w:rPr>
-        <w:rStyle w:val="PageNumber"/>
+        <w:rStyle w:val="a4"/>
         <w:rtl/>
       </w:rPr>
       <w:fldChar w:fldCharType="begin"/>
     </w:r>
     <w:r>
       <w:rPr>
-        <w:rStyle w:val="PageNumber"/>
+        <w:rStyle w:val="a4"/>
       </w:rPr>
       <w:instrText xml:space="preserve">PAGE  </w:instrText>
     </w:r>
     <w:r>
       <w:rPr>
-        <w:rStyle w:val="PageNumber"/>
+        <w:rStyle w:val="a4"/>
         <w:rtl/>
       </w:rPr>
       <w:fldChar w:fldCharType="end"/>
@@ -1977,14 +2027,14 @@
   </w:p>
   <w:p>
     <w:pPr>
-      <w:pStyle w:val="Footer"/>
+      <w:pStyle w:val="a5"/>
     </w:pPr>
   </w:p>
 </w:ftr>
 </file>
 
 <file path=word/footnotes.xml><?xml version="1.0" encoding="utf-8"?>
-<w:footnotes xmlns:wpc="http://schemas.microsoft.com/office/word/2010/wordprocessingCanvas" xmlns:cx="http://schemas.microsoft.com/office/drawing/2014/chartex" xmlns:cx1="http://schemas.microsoft.com/office/drawing/2015/9/8/chartex" xmlns:cx2="http://schemas.microsoft.com/office/drawing/2015/10/21/chartex" xmlns:cx3="http://schemas.microsoft.com/office/drawing/2016/5/9/chartex" xmlns:cx4="http://schemas.microsoft.com/office/drawing/2016/5/10/chartex" xmlns:cx5="http://schemas.microsoft.com/office/drawing/2016/5/11/chartex" xmlns:cx6="http://schemas.microsoft.com/office/drawing/2016/5/12/chartex" xmlns:cx7="http://schemas.microsoft.com/office/drawing/2016/5/13/chartex" xmlns:cx8="http://schemas.microsoft.com/office/drawing/2016/5/14/chartex" xmlns:mc="http://schemas.openxmlformats.org/markup-compatibility/2006" xmlns:aink="http://schemas.microsoft.com/office/drawing/2016/ink" xmlns:am3d="http://schemas.microsoft.com/office/drawing/2017/model3d" xmlns:o="urn:schemas-microsoft-com:office:office" xmlns:oel="http://schemas.microsoft.com/office/2019/extlst" xmlns:r="http://schemas.openxmlformats.org/officeDocument/2006/relationships" xmlns:m="http://schemas.openxmlformats.org/officeDocument/2006/math" xmlns:v="urn:schemas-microsoft-com:vml" xmlns:wp14="http://schemas.microsoft.com/office/word/2010/wordprocessingDrawing" xmlns:wp="http://schemas.openxmlformats.org/drawingml/2006/wordprocessingDrawing" xmlns:w10="urn:schemas-microsoft-com:office:word" xmlns:w="http://schemas.openxmlformats.org/wordprocessingml/2006/main" xmlns:w14="http://schemas.microsoft.com/office/word/2010/wordml" xmlns:w15="http://schemas.microsoft.com/office/word/2012/wordml" xmlns:w16cex="http://schemas.microsoft.com/office/word/2018/wordml/cex" xmlns:w16cid="http://schemas.microsoft.com/office/word/2016/wordml/cid" xmlns:w16="http://schemas.microsoft.com/office/word/2018/wordml" xmlns:w16du="http://schemas.microsoft.com/office/word/2023/wordml/word16du" xmlns:w16sdtdh="http://schemas.microsoft.com/office/word/2020/wordml/sdtdatahash" xmlns:w16sdtfl="http://schemas.microsoft.com/office/word/2024/wordml/sdtformatlock" xmlns:w16se="http://schemas.microsoft.com/office/word/2015/wordml/symex" xmlns:wpg="http://schemas.microsoft.com/office/word/2010/wordprocessingGroup" xmlns:wpi="http://schemas.microsoft.com/office/word/2010/wordprocessingInk" xmlns:wne="http://schemas.microsoft.com/office/word/2006/wordml" xmlns:wps="http://schemas.microsoft.com/office/word/2010/wordprocessingShape" mc:Ignorable="w14 w15 w16se w16cid w16 w16cex w16sdtdh w16sdtfl w16du wp14">
+<w:footnotes xmlns:wpc="http://schemas.microsoft.com/office/word/2010/wordprocessingCanvas" xmlns:cx="http://schemas.microsoft.com/office/drawing/2014/chartex" xmlns:cx1="http://schemas.microsoft.com/office/drawing/2015/9/8/chartex" xmlns:cx2="http://schemas.microsoft.com/office/drawing/2015/10/21/chartex" xmlns:cx3="http://schemas.microsoft.com/office/drawing/2016/5/9/chartex" xmlns:cx4="http://schemas.microsoft.com/office/drawing/2016/5/10/chartex" xmlns:cx5="http://schemas.microsoft.com/office/drawing/2016/5/11/chartex" xmlns:cx6="http://schemas.microsoft.com/office/drawing/2016/5/12/chartex" xmlns:cx7="http://schemas.microsoft.com/office/drawing/2016/5/13/chartex" xmlns:cx8="http://schemas.microsoft.com/office/drawing/2016/5/14/chartex" xmlns:mc="http://schemas.openxmlformats.org/markup-compatibility/2006" xmlns:aink="http://schemas.microsoft.com/office/drawing/2016/ink" xmlns:am3d="http://schemas.microsoft.com/office/drawing/2017/model3d" xmlns:o="urn:schemas-microsoft-com:office:office" xmlns:r="http://schemas.openxmlformats.org/officeDocument/2006/relationships" xmlns:m="http://schemas.openxmlformats.org/officeDocument/2006/math" xmlns:v="urn:schemas-microsoft-com:vml" xmlns:wp14="http://schemas.microsoft.com/office/word/2010/wordprocessingDrawing" xmlns:wp="http://schemas.openxmlformats.org/drawingml/2006/wordprocessingDrawing" xmlns:w10="urn:schemas-microsoft-com:office:word" xmlns:w="http://schemas.openxmlformats.org/wordprocessingml/2006/main" xmlns:w14="http://schemas.microsoft.com/office/word/2010/wordml" xmlns:w15="http://schemas.microsoft.com/office/word/2012/wordml" xmlns:w16cid="http://schemas.microsoft.com/office/word/2016/wordml/cid" xmlns:w16se="http://schemas.microsoft.com/office/word/2015/wordml/symex" xmlns:wpg="http://schemas.microsoft.com/office/word/2010/wordprocessingGroup" xmlns:wpi="http://schemas.microsoft.com/office/word/2010/wordprocessingInk" xmlns:wne="http://schemas.microsoft.com/office/word/2006/wordml" xmlns:wps="http://schemas.microsoft.com/office/word/2010/wordprocessingShape" mc:Ignorable="w14 w15 w16se w16cid wp14">
   <w:footnote w:type="separator" w:id="-1">
     <w:p>
       <w:r>
@@ -2003,31 +2053,31 @@
 </file>
 
 <file path=word/header1.xml><?xml version="1.0" encoding="utf-8"?>
-<w:hdr xmlns:wpc="http://schemas.microsoft.com/office/word/2010/wordprocessingCanvas" xmlns:cx="http://schemas.microsoft.com/office/drawing/2014/chartex" xmlns:cx1="http://schemas.microsoft.com/office/drawing/2015/9/8/chartex" xmlns:cx2="http://schemas.microsoft.com/office/drawing/2015/10/21/chartex" xmlns:cx3="http://schemas.microsoft.com/office/drawing/2016/5/9/chartex" xmlns:cx4="http://schemas.microsoft.com/office/drawing/2016/5/10/chartex" xmlns:cx5="http://schemas.microsoft.com/office/drawing/2016/5/11/chartex" xmlns:cx6="http://schemas.microsoft.com/office/drawing/2016/5/12/chartex" xmlns:cx7="http://schemas.microsoft.com/office/drawing/2016/5/13/chartex" xmlns:cx8="http://schemas.microsoft.com/office/drawing/2016/5/14/chartex" xmlns:mc="http://schemas.openxmlformats.org/markup-compatibility/2006" xmlns:aink="http://schemas.microsoft.com/office/drawing/2016/ink" xmlns:am3d="http://schemas.microsoft.com/office/drawing/2017/model3d" xmlns:o="urn:schemas-microsoft-com:office:office" xmlns:oel="http://schemas.microsoft.com/office/2019/extlst" xmlns:r="http://schemas.openxmlformats.org/officeDocument/2006/relationships" xmlns:m="http://schemas.openxmlformats.org/officeDocument/2006/math" xmlns:v="urn:schemas-microsoft-com:vml" xmlns:wp14="http://schemas.microsoft.com/office/word/2010/wordprocessingDrawing" xmlns:wp="http://schemas.openxmlformats.org/drawingml/2006/wordprocessingDrawing" xmlns:w10="urn:schemas-microsoft-com:office:word" xmlns:w="http://schemas.openxmlformats.org/wordprocessingml/2006/main" xmlns:w14="http://schemas.microsoft.com/office/word/2010/wordml" xmlns:w15="http://schemas.microsoft.com/office/word/2012/wordml" xmlns:w16cex="http://schemas.microsoft.com/office/word/2018/wordml/cex" xmlns:w16cid="http://schemas.microsoft.com/office/word/2016/wordml/cid" xmlns:w16="http://schemas.microsoft.com/office/word/2018/wordml" xmlns:w16du="http://schemas.microsoft.com/office/word/2023/wordml/word16du" xmlns:w16sdtdh="http://schemas.microsoft.com/office/word/2020/wordml/sdtdatahash" xmlns:w16sdtfl="http://schemas.microsoft.com/office/word/2024/wordml/sdtformatlock" xmlns:w16se="http://schemas.microsoft.com/office/word/2015/wordml/symex" xmlns:wpg="http://schemas.microsoft.com/office/word/2010/wordprocessingGroup" xmlns:wpi="http://schemas.microsoft.com/office/word/2010/wordprocessingInk" xmlns:wne="http://schemas.microsoft.com/office/word/2006/wordml" xmlns:wps="http://schemas.microsoft.com/office/word/2010/wordprocessingShape" mc:Ignorable="w14 w15 w16se w16cid w16 w16cex w16sdtdh w16sdtfl w16du wp14">
+<w:hdr xmlns:wpc="http://schemas.microsoft.com/office/word/2010/wordprocessingCanvas" xmlns:cx="http://schemas.microsoft.com/office/drawing/2014/chartex" xmlns:cx1="http://schemas.microsoft.com/office/drawing/2015/9/8/chartex" xmlns:cx2="http://schemas.microsoft.com/office/drawing/2015/10/21/chartex" xmlns:cx3="http://schemas.microsoft.com/office/drawing/2016/5/9/chartex" xmlns:cx4="http://schemas.microsoft.com/office/drawing/2016/5/10/chartex" xmlns:cx5="http://schemas.microsoft.com/office/drawing/2016/5/11/chartex" xmlns:cx6="http://schemas.microsoft.com/office/drawing/2016/5/12/chartex" xmlns:cx7="http://schemas.microsoft.com/office/drawing/2016/5/13/chartex" xmlns:cx8="http://schemas.microsoft.com/office/drawing/2016/5/14/chartex" xmlns:mc="http://schemas.openxmlformats.org/markup-compatibility/2006" xmlns:aink="http://schemas.microsoft.com/office/drawing/2016/ink" xmlns:am3d="http://schemas.microsoft.com/office/drawing/2017/model3d" xmlns:o="urn:schemas-microsoft-com:office:office" xmlns:r="http://schemas.openxmlformats.org/officeDocument/2006/relationships" xmlns:m="http://schemas.openxmlformats.org/officeDocument/2006/math" xmlns:v="urn:schemas-microsoft-com:vml" xmlns:wp14="http://schemas.microsoft.com/office/word/2010/wordprocessingDrawing" xmlns:wp="http://schemas.openxmlformats.org/drawingml/2006/wordprocessingDrawing" xmlns:w10="urn:schemas-microsoft-com:office:word" xmlns:w="http://schemas.openxmlformats.org/wordprocessingml/2006/main" xmlns:w14="http://schemas.microsoft.com/office/word/2010/wordml" xmlns:w15="http://schemas.microsoft.com/office/word/2012/wordml" xmlns:w16cid="http://schemas.microsoft.com/office/word/2016/wordml/cid" xmlns:w16se="http://schemas.microsoft.com/office/word/2015/wordml/symex" xmlns:wpg="http://schemas.microsoft.com/office/word/2010/wordprocessingGroup" xmlns:wpi="http://schemas.microsoft.com/office/word/2010/wordprocessingInk" xmlns:wne="http://schemas.microsoft.com/office/word/2006/wordml" xmlns:wps="http://schemas.microsoft.com/office/word/2010/wordprocessingShape" mc:Ignorable="w14 w15 w16se w16cid wp14">
   <w:p>
     <w:pPr>
-      <w:pStyle w:val="Header"/>
+      <w:pStyle w:val="a3"/>
       <w:framePr w:wrap="around" w:vAnchor="text" w:hAnchor="text" w:xAlign="right" w:y="1"/>
       <w:rPr>
-        <w:rStyle w:val="PageNumber"/>
+        <w:rStyle w:val="a4"/>
       </w:rPr>
     </w:pPr>
     <w:r>
       <w:rPr>
-        <w:rStyle w:val="PageNumber"/>
+        <w:rStyle w:val="a4"/>
         <w:rtl/>
       </w:rPr>
       <w:fldChar w:fldCharType="begin"/>
     </w:r>
     <w:r>
       <w:rPr>
-        <w:rStyle w:val="PageNumber"/>
+        <w:rStyle w:val="a4"/>
       </w:rPr>
       <w:instrText xml:space="preserve">PAGE  </w:instrText>
     </w:r>
     <w:r>
       <w:rPr>
-        <w:rStyle w:val="PageNumber"/>
+        <w:rStyle w:val="a4"/>
         <w:rtl/>
       </w:rPr>
       <w:fldChar w:fldCharType="end"/>
@@ -2035,7 +2085,7 @@
   </w:p>
   <w:p>
     <w:pPr>
-      <w:pStyle w:val="Header"/>
+      <w:pStyle w:val="a3"/>
       <w:ind w:firstLine="360"/>
     </w:pPr>
   </w:p>
@@ -2043,7 +2093,7 @@
 </file>
 
 <file path=word/numbering.xml><?xml version="1.0" encoding="utf-8"?>
-<w:numbering xmlns:wpc="http://schemas.microsoft.com/office/word/2010/wordprocessingCanvas" xmlns:cx="http://schemas.microsoft.com/office/drawing/2014/chartex" xmlns:cx1="http://schemas.microsoft.com/office/drawing/2015/9/8/chartex" xmlns:cx2="http://schemas.microsoft.com/office/drawing/2015/10/21/chartex" xmlns:cx3="http://schemas.microsoft.com/office/drawing/2016/5/9/chartex" xmlns:cx4="http://schemas.microsoft.com/office/drawing/2016/5/10/chartex" xmlns:cx5="http://schemas.microsoft.com/office/drawing/2016/5/11/chartex" xmlns:cx6="http://schemas.microsoft.com/office/drawing/2016/5/12/chartex" xmlns:cx7="http://schemas.microsoft.com/office/drawing/2016/5/13/chartex" xmlns:cx8="http://schemas.microsoft.com/office/drawing/2016/5/14/chartex" xmlns:mc="http://schemas.openxmlformats.org/markup-compatibility/2006" xmlns:aink="http://schemas.microsoft.com/office/drawing/2016/ink" xmlns:am3d="http://schemas.microsoft.com/office/drawing/2017/model3d" xmlns:o="urn:schemas-microsoft-com:office:office" xmlns:oel="http://schemas.microsoft.com/office/2019/extlst" xmlns:r="http://schemas.openxmlformats.org/officeDocument/2006/relationships" xmlns:m="http://schemas.openxmlformats.org/officeDocument/2006/math" xmlns:v="urn:schemas-microsoft-com:vml" xmlns:wp14="http://schemas.microsoft.com/office/word/2010/wordprocessingDrawing" xmlns:wp="http://schemas.openxmlformats.org/drawingml/2006/wordprocessingDrawing" xmlns:w10="urn:schemas-microsoft-com:office:word" xmlns:w="http://schemas.openxmlformats.org/wordprocessingml/2006/main" xmlns:w14="http://schemas.microsoft.com/office/word/2010/wordml" xmlns:w15="http://schemas.microsoft.com/office/word/2012/wordml" xmlns:w16cex="http://schemas.microsoft.com/office/word/2018/wordml/cex" xmlns:w16cid="http://schemas.microsoft.com/office/word/2016/wordml/cid" xmlns:w16="http://schemas.microsoft.com/office/word/2018/wordml" xmlns:w16du="http://schemas.microsoft.com/office/word/2023/wordml/word16du" xmlns:w16sdtdh="http://schemas.microsoft.com/office/word/2020/wordml/sdtdatahash" xmlns:w16sdtfl="http://schemas.microsoft.com/office/word/2024/wordml/sdtformatlock" xmlns:w16se="http://schemas.microsoft.com/office/word/2015/wordml/symex" xmlns:wpg="http://schemas.microsoft.com/office/word/2010/wordprocessingGroup" xmlns:wpi="http://schemas.microsoft.com/office/word/2010/wordprocessingInk" xmlns:wne="http://schemas.microsoft.com/office/word/2006/wordml" xmlns:wps="http://schemas.microsoft.com/office/word/2010/wordprocessingShape" mc:Ignorable="w14 w15 w16se w16cid w16 w16cex w16sdtdh w16sdtfl w16du wp14">
+<w:numbering xmlns:wpc="http://schemas.microsoft.com/office/word/2010/wordprocessingCanvas" xmlns:cx="http://schemas.microsoft.com/office/drawing/2014/chartex" xmlns:cx1="http://schemas.microsoft.com/office/drawing/2015/9/8/chartex" xmlns:cx2="http://schemas.microsoft.com/office/drawing/2015/10/21/chartex" xmlns:cx3="http://schemas.microsoft.com/office/drawing/2016/5/9/chartex" xmlns:cx4="http://schemas.microsoft.com/office/drawing/2016/5/10/chartex" xmlns:cx5="http://schemas.microsoft.com/office/drawing/2016/5/11/chartex" xmlns:cx6="http://schemas.microsoft.com/office/drawing/2016/5/12/chartex" xmlns:cx7="http://schemas.microsoft.com/office/drawing/2016/5/13/chartex" xmlns:cx8="http://schemas.microsoft.com/office/drawing/2016/5/14/chartex" xmlns:mc="http://schemas.openxmlformats.org/markup-compatibility/2006" xmlns:aink="http://schemas.microsoft.com/office/drawing/2016/ink" xmlns:am3d="http://schemas.microsoft.com/office/drawing/2017/model3d" xmlns:o="urn:schemas-microsoft-com:office:office" xmlns:r="http://schemas.openxmlformats.org/officeDocument/2006/relationships" xmlns:m="http://schemas.openxmlformats.org/officeDocument/2006/math" xmlns:v="urn:schemas-microsoft-com:vml" xmlns:wp14="http://schemas.microsoft.com/office/word/2010/wordprocessingDrawing" xmlns:wp="http://schemas.openxmlformats.org/drawingml/2006/wordprocessingDrawing" xmlns:w10="urn:schemas-microsoft-com:office:word" xmlns:w="http://schemas.openxmlformats.org/wordprocessingml/2006/main" xmlns:w14="http://schemas.microsoft.com/office/word/2010/wordml" xmlns:w15="http://schemas.microsoft.com/office/word/2012/wordml" xmlns:w16cid="http://schemas.microsoft.com/office/word/2016/wordml/cid" xmlns:w16se="http://schemas.microsoft.com/office/word/2015/wordml/symex" xmlns:wpg="http://schemas.microsoft.com/office/word/2010/wordprocessingGroup" xmlns:wpi="http://schemas.microsoft.com/office/word/2010/wordprocessingInk" xmlns:wne="http://schemas.microsoft.com/office/word/2006/wordml" xmlns:wps="http://schemas.microsoft.com/office/word/2010/wordprocessingShape" mc:Ignorable="w14 w15 w16se w16cid wp14">
   <w:abstractNum w:abstractNumId="0" w15:restartNumberingAfterBreak="0">
     <w:nsid w:val="00BE3A5D"/>
     <w:multiLevelType w:val="multilevel"/>
@@ -6860,131 +6910,131 @@
       </w:rPr>
     </w:lvl>
   </w:abstractNum>
-  <w:num w:numId="1" w16cid:durableId="1127577493">
+  <w:num w:numId="1">
     <w:abstractNumId w:val="29"/>
   </w:num>
-  <w:num w:numId="2" w16cid:durableId="80027540">
+  <w:num w:numId="2">
     <w:abstractNumId w:val="30"/>
   </w:num>
-  <w:num w:numId="3" w16cid:durableId="191772351">
+  <w:num w:numId="3">
     <w:abstractNumId w:val="19"/>
   </w:num>
-  <w:num w:numId="4" w16cid:durableId="872688711">
+  <w:num w:numId="4">
     <w:abstractNumId w:val="33"/>
   </w:num>
-  <w:num w:numId="5" w16cid:durableId="931352220">
+  <w:num w:numId="5">
     <w:abstractNumId w:val="17"/>
   </w:num>
-  <w:num w:numId="6" w16cid:durableId="1517891342">
+  <w:num w:numId="6">
     <w:abstractNumId w:val="12"/>
   </w:num>
-  <w:num w:numId="7" w16cid:durableId="954101385">
+  <w:num w:numId="7">
     <w:abstractNumId w:val="28"/>
   </w:num>
-  <w:num w:numId="8" w16cid:durableId="1936471364">
+  <w:num w:numId="8">
     <w:abstractNumId w:val="20"/>
   </w:num>
-  <w:num w:numId="9" w16cid:durableId="1175220699">
+  <w:num w:numId="9">
     <w:abstractNumId w:val="15"/>
   </w:num>
-  <w:num w:numId="10" w16cid:durableId="1762291075">
+  <w:num w:numId="10">
     <w:abstractNumId w:val="5"/>
   </w:num>
-  <w:num w:numId="11" w16cid:durableId="1863277549">
+  <w:num w:numId="11">
     <w:abstractNumId w:val="24"/>
   </w:num>
-  <w:num w:numId="12" w16cid:durableId="1325888667">
+  <w:num w:numId="12">
     <w:abstractNumId w:val="8"/>
   </w:num>
-  <w:num w:numId="13" w16cid:durableId="1266499768">
+  <w:num w:numId="13">
     <w:abstractNumId w:val="22"/>
   </w:num>
-  <w:num w:numId="14" w16cid:durableId="1280456948">
+  <w:num w:numId="14">
     <w:abstractNumId w:val="2"/>
   </w:num>
-  <w:num w:numId="15" w16cid:durableId="336202108">
+  <w:num w:numId="15">
     <w:abstractNumId w:val="32"/>
   </w:num>
-  <w:num w:numId="16" w16cid:durableId="1233542448">
+  <w:num w:numId="16">
     <w:abstractNumId w:val="37"/>
   </w:num>
-  <w:num w:numId="17" w16cid:durableId="802697310">
+  <w:num w:numId="17">
     <w:abstractNumId w:val="11"/>
   </w:num>
-  <w:num w:numId="18" w16cid:durableId="2125609655">
+  <w:num w:numId="18">
     <w:abstractNumId w:val="23"/>
   </w:num>
-  <w:num w:numId="19" w16cid:durableId="426120458">
+  <w:num w:numId="19">
     <w:abstractNumId w:val="36"/>
   </w:num>
-  <w:num w:numId="20" w16cid:durableId="1542786253">
+  <w:num w:numId="20">
     <w:abstractNumId w:val="35"/>
   </w:num>
-  <w:num w:numId="21" w16cid:durableId="1381830945">
+  <w:num w:numId="21">
     <w:abstractNumId w:val="7"/>
   </w:num>
-  <w:num w:numId="22" w16cid:durableId="2117947589">
+  <w:num w:numId="22">
     <w:abstractNumId w:val="16"/>
   </w:num>
-  <w:num w:numId="23" w16cid:durableId="909509816">
+  <w:num w:numId="23">
     <w:abstractNumId w:val="0"/>
   </w:num>
-  <w:num w:numId="24" w16cid:durableId="482740318">
+  <w:num w:numId="24">
     <w:abstractNumId w:val="13"/>
   </w:num>
-  <w:num w:numId="25" w16cid:durableId="1983390776">
+  <w:num w:numId="25">
     <w:abstractNumId w:val="39"/>
   </w:num>
-  <w:num w:numId="26" w16cid:durableId="1465928874">
+  <w:num w:numId="26">
     <w:abstractNumId w:val="38"/>
   </w:num>
-  <w:num w:numId="27" w16cid:durableId="1753232656">
+  <w:num w:numId="27">
     <w:abstractNumId w:val="10"/>
   </w:num>
-  <w:num w:numId="28" w16cid:durableId="1941254343">
+  <w:num w:numId="28">
     <w:abstractNumId w:val="3"/>
   </w:num>
-  <w:num w:numId="29" w16cid:durableId="864517484">
+  <w:num w:numId="29">
     <w:abstractNumId w:val="4"/>
   </w:num>
-  <w:num w:numId="30" w16cid:durableId="158162292">
+  <w:num w:numId="30">
     <w:abstractNumId w:val="21"/>
   </w:num>
-  <w:num w:numId="31" w16cid:durableId="1167131369">
+  <w:num w:numId="31">
     <w:abstractNumId w:val="9"/>
   </w:num>
-  <w:num w:numId="32" w16cid:durableId="487328467">
+  <w:num w:numId="32">
     <w:abstractNumId w:val="34"/>
   </w:num>
-  <w:num w:numId="33" w16cid:durableId="430782685">
+  <w:num w:numId="33">
     <w:abstractNumId w:val="27"/>
   </w:num>
-  <w:num w:numId="34" w16cid:durableId="1319459186">
+  <w:num w:numId="34">
     <w:abstractNumId w:val="6"/>
   </w:num>
-  <w:num w:numId="35" w16cid:durableId="2073119181">
+  <w:num w:numId="35">
     <w:abstractNumId w:val="1"/>
   </w:num>
-  <w:num w:numId="36" w16cid:durableId="541866232">
+  <w:num w:numId="36">
     <w:abstractNumId w:val="25"/>
   </w:num>
-  <w:num w:numId="37" w16cid:durableId="1353336354">
+  <w:num w:numId="37">
     <w:abstractNumId w:val="18"/>
   </w:num>
-  <w:num w:numId="38" w16cid:durableId="1701858104">
+  <w:num w:numId="38">
     <w:abstractNumId w:val="14"/>
   </w:num>
-  <w:num w:numId="39" w16cid:durableId="1550147589">
+  <w:num w:numId="39">
     <w:abstractNumId w:val="31"/>
   </w:num>
-  <w:num w:numId="40" w16cid:durableId="1691108089">
+  <w:num w:numId="40">
     <w:abstractNumId w:val="26"/>
   </w:num>
 </w:numbering>
 </file>
 
 <file path=word/styles.xml><?xml version="1.0" encoding="utf-8"?>
-<w:styles xmlns:mc="http://schemas.openxmlformats.org/markup-compatibility/2006" xmlns:r="http://schemas.openxmlformats.org/officeDocument/2006/relationships" xmlns:w="http://schemas.openxmlformats.org/wordprocessingml/2006/main" xmlns:w14="http://schemas.microsoft.com/office/word/2010/wordml" xmlns:w15="http://schemas.microsoft.com/office/word/2012/wordml" xmlns:w16cex="http://schemas.microsoft.com/office/word/2018/wordml/cex" xmlns:w16cid="http://schemas.microsoft.com/office/word/2016/wordml/cid" xmlns:w16="http://schemas.microsoft.com/office/word/2018/wordml" xmlns:w16du="http://schemas.microsoft.com/office/word/2023/wordml/word16du" xmlns:w16sdtdh="http://schemas.microsoft.com/office/word/2020/wordml/sdtdatahash" xmlns:w16sdtfl="http://schemas.microsoft.com/office/word/2024/wordml/sdtformatlock" xmlns:w16se="http://schemas.microsoft.com/office/word/2015/wordml/symex" mc:Ignorable="w14 w15 w16se w16cid w16 w16cex w16sdtdh w16sdtfl w16du">
+<w:styles xmlns:mc="http://schemas.openxmlformats.org/markup-compatibility/2006" xmlns:r="http://schemas.openxmlformats.org/officeDocument/2006/relationships" xmlns:w="http://schemas.openxmlformats.org/wordprocessingml/2006/main" xmlns:w14="http://schemas.microsoft.com/office/word/2010/wordml" xmlns:w15="http://schemas.microsoft.com/office/word/2012/wordml" xmlns:w16cid="http://schemas.microsoft.com/office/word/2016/wordml/cid" xmlns:w16se="http://schemas.microsoft.com/office/word/2015/wordml/symex" mc:Ignorable="w14 w15 w16se w16cid">
   <w:docDefaults>
     <w:rPrDefault>
       <w:rPr>
@@ -6994,7 +7044,7 @@
     </w:rPrDefault>
     <w:pPrDefault/>
   </w:docDefaults>
-  <w:latentStyles w:defLockedState="0" w:defUIPriority="0" w:defSemiHidden="0" w:defUnhideWhenUsed="0" w:defQFormat="0" w:count="376">
+  <w:latentStyles w:defLockedState="0" w:defUIPriority="0" w:defSemiHidden="0" w:defUnhideWhenUsed="0" w:defQFormat="0" w:count="375">
     <w:lsdException w:name="Normal" w:qFormat="1"/>
     <w:lsdException w:name="heading 1" w:qFormat="1"/>
     <w:lsdException w:name="heading 2" w:semiHidden="1" w:unhideWhenUsed="1" w:qFormat="1"/>
@@ -7273,9 +7323,8 @@
     <w:lsdException w:name="Smart Hyperlink" w:semiHidden="1" w:uiPriority="99" w:unhideWhenUsed="1"/>
     <w:lsdException w:name="Hashtag" w:semiHidden="1" w:uiPriority="99" w:unhideWhenUsed="1"/>
     <w:lsdException w:name="Unresolved Mention" w:semiHidden="1" w:uiPriority="99" w:unhideWhenUsed="1"/>
-    <w:lsdException w:name="Smart Link" w:semiHidden="1" w:uiPriority="99" w:unhideWhenUsed="1"/>
   </w:latentStyles>
-  <w:style w:type="paragraph" w:default="1" w:styleId="Normal">
+  <w:style w:type="paragraph" w:default="1" w:styleId="a">
     <w:name w:val="Normal"/>
     <w:qFormat/>
     <w:rsid w:val="00780AE7"/>
@@ -7287,12 +7336,13 @@
       <w:szCs w:val="24"/>
     </w:rPr>
   </w:style>
-  <w:style w:type="character" w:default="1" w:styleId="DefaultParagraphFont">
+  <w:style w:type="character" w:default="1" w:styleId="a0">
     <w:name w:val="Default Paragraph Font"/>
     <w:uiPriority w:val="1"/>
+    <w:semiHidden/>
     <w:unhideWhenUsed/>
   </w:style>
-  <w:style w:type="table" w:default="1" w:styleId="TableNormal">
+  <w:style w:type="table" w:default="1" w:styleId="a1">
     <w:name w:val="Normal Table"/>
     <w:uiPriority w:val="99"/>
     <w:semiHidden/>
@@ -7307,7 +7357,7 @@
       </w:tblCellMar>
     </w:tblPr>
   </w:style>
-  <w:style w:type="numbering" w:default="1" w:styleId="NoList">
+  <w:style w:type="numbering" w:default="1" w:styleId="a2">
     <w:name w:val="No List"/>
     <w:uiPriority w:val="99"/>
     <w:semiHidden/>
@@ -7328,9 +7378,9 @@
       <w:effect w:val="none"/>
     </w:rPr>
   </w:style>
-  <w:style w:type="paragraph" w:styleId="Header">
+  <w:style w:type="paragraph" w:styleId="a3">
     <w:name w:val="header"/>
-    <w:basedOn w:val="Normal"/>
+    <w:basedOn w:val="a"/>
     <w:pPr>
       <w:tabs>
         <w:tab w:val="center" w:pos="4153"/>
@@ -7338,13 +7388,13 @@
       </w:tabs>
     </w:pPr>
   </w:style>
-  <w:style w:type="character" w:styleId="PageNumber">
+  <w:style w:type="character" w:styleId="a4">
     <w:name w:val="page number"/>
-    <w:basedOn w:val="DefaultParagraphFont"/>
+    <w:basedOn w:val="a0"/>
   </w:style>
-  <w:style w:type="paragraph" w:styleId="Footer">
+  <w:style w:type="paragraph" w:styleId="a5">
     <w:name w:val="footer"/>
-    <w:basedOn w:val="Normal"/>
+    <w:basedOn w:val="a"/>
     <w:pPr>
       <w:tabs>
         <w:tab w:val="center" w:pos="4153"/>
@@ -7352,9 +7402,9 @@
       </w:tabs>
     </w:pPr>
   </w:style>
-  <w:style w:type="table" w:customStyle="1" w:styleId="a">
+  <w:style w:type="table" w:customStyle="1" w:styleId="a6">
     <w:name w:val="טבלת רשת"/>
-    <w:basedOn w:val="TableNormal"/>
+    <w:basedOn w:val="a1"/>
     <w:rsid w:val="00725F55"/>
     <w:pPr>
       <w:bidi/>
@@ -7370,7 +7420,7 @@
       </w:tblBorders>
     </w:tblPr>
   </w:style>
-  <w:style w:type="character" w:styleId="Strong">
+  <w:style w:type="character" w:styleId="a7">
     <w:name w:val="Strong"/>
     <w:qFormat/>
     <w:rsid w:val="00355C38"/>

</xml_diff>